<commit_message>
docs: resuelve observaciones del anexo B
</commit_message>
<xml_diff>
--- a/deliverables/informe_final/Parte_Cono_de_Carga_Informe_Final.docx
+++ b/deliverables/informe_final/Parte_Cono_de_Carga_Informe_Final.docx
@@ -17,29 +17,31 @@
           <w:lang w:val="es-CL"/>
         </w:rPr>
         <w:t>UNIVERSIDAD DE CONCEPCIÓN</w:t>
-      </w:r>
-      <w:r>
-        <w:rPr>
-          <w:b/>
-          <w:lang w:val="es-CL"/>
-        </w:rPr>
         <w:br/>
         <w:t>FACULTAD DE INGENIERÍA</w:t>
+        <w:br/>
+        <w:t>DEPARTAMENTO DE INGENIERÍA INFORMÁTICA Y CS. DE LA COMPUTACIÓN</w:t>
+        <w:br/>
+        <w:t>CARRERA DE INGENIERÍA CIVIL INFORMÁTICA</w:t>
+        <w:br/>
       </w:r>
       <w:r>
         <w:rPr>
           <w:b/>
           <w:lang w:val="es-CL"/>
         </w:rPr>
-        <w:br/>
-        <w:t>DEPARTAMENTO DE INGENIERÍA INFORMÁTICA Y CIENCIAS DE LA COMPUTACIÓN</w:t>
       </w:r>
       <w:r>
         <w:rPr>
           <w:b/>
           <w:lang w:val="es-CL"/>
         </w:rPr>
-        <w:br/>
+      </w:r>
+      <w:r>
+        <w:rPr>
+          <w:b/>
+          <w:lang w:val="es-CL"/>
+        </w:rPr>
       </w:r>
     </w:p>
     <w:p>
@@ -325,7 +327,7 @@
         <w:rPr>
           <w:lang w:val="es-CL"/>
         </w:rPr>
-        <w:t>La Memoria se desarrolla en la Facultad de Ingeniería de la Universidad de Concepción, institución académica responsable de la formación y evaluación del trabajo. PSINet participa como contraparte técnica y vincula el desarrollo con una aplicación industrial de visión computacional en minería. Los registros utilizados corresponden a camiones de extracción observados en la operación de Compañía Minera Doña Inés de Collahuasi, ubicada en la Región de Tarapacá. Esta procedencia entrega condiciones reales de iluminación, polvo, escala, movimiento y variación de equipos, aunque no implica por sí sola una participación académica formal de Collahuasi en la Memoria [15]-[17].</w:t>
+        <w:t>La Memoria se desarrolla en la carrera de Ingeniería Civil Informática de la Facultad de Ingeniería de la Universidad de Concepción, institución académica responsable de la formación y evaluación del trabajo. PSINet participa como contraparte técnica a través de su departamento de I+D y vincula el desarrollo con una aplicación industrial de visión computacional en minería. Los registros utilizados provienen de la operación de Compañía Minera Doña Inés de Collahuasi, ubicada en la Región de Tarapacá. Collahuasi se considera origen de los datos y no institución colaboradora formal de la Memoria. El permiso y la realización del trabajo fueron consultados mediante PSINet en reuniones con gerencias de ambas organizaciones [15]-[17].</w:t>
       </w:r>
     </w:p>
     <w:p>
@@ -6922,7 +6924,7 @@
         <w:rPr>
           <w:lang w:val="es-CL"/>
         </w:rPr>
-        <w:t>La evaluación se organiza en tres niveles. Primero se observan las métricas internas del entrenamiento para comprobar que el segmentador aprende la clase. Segundo se utiliza una prueba técnica balanceada de 90 imágenes, con 30 ejemplos seleccionados visualmente como centrados, 30 como izquierda y 30 como derecha, para medir la clasificación de extremo a extremo. Tercero se procesa una muestra de 1.248 imágenes para describir la capacidad operacional, los descartes y la distribución de salidas.</w:t>
+        <w:t>La evaluación considera tres niveles: métricas internas del entrenamiento; una prueba técnica balanceada de 90 imágenes, con 30 casos visuales por clase, para medir la clasificación de extremo a extremo; y una muestra de 1.248 imágenes para estudiar el comportamiento operacional, los descartes y la distribución de salidas en una cantidad mayor de escenarios.</w:t>
       </w:r>
     </w:p>
     <w:p>
@@ -6933,7 +6935,7 @@
       </w:pPr>
       <w:r>
         <w:rPr/>
-        <w:t>Las etiquetas esperadas de la prueba técnica representan juicio visual y no mediciones físicas. Tampoco se encuentra documentado que las 90 imágenes estén separadas de todo dato utilizado durante el desarrollo del modelo de percepción. En consecuencia, los resultados se interpretan como validación técnica local, no como estimación independiente definitiva para producción.</w:t>
+        <w:t>Las 90 imágenes proceden del banco de evidencias CAEX del proyecto de Granulometría (data/raw/evidencias_caex/images), una base distinta del entrenamiento y formada por registros de fechas posteriores. Se seleccionaron visualmente 30 casos centrados, 30 a izquierda y 30 a derecha. Las etiquetas representan apariencia visual, no mediciones físicas. La separación temporal reduce el riesgo de reutilizar imágenes de entrenamiento, aunque el tamaño y la selección dirigida mantienen el resultado como validación técnica local.</w:t>
       </w:r>
     </w:p>
     <w:p>
@@ -8579,7 +8581,7 @@
         <w:rPr>
           <w:lang w:val="es-CL"/>
         </w:rPr>
-        <w:t>La muestra operacional se procesa con confianza 0,35 y selección de la instancia de mayor área. Se obtienen 1.183 imágenes válidas y 65 no evaluables. De estas últimas, 42 corresponden a máscaras vacías y 23 a máscaras que tocan algún borde de la imagen. El descarte por borde evita que una carga incompleta genere picos falsos o una simetría artificial.</w:t>
+        <w:t>Las 1.248 imágenes también proceden del banco de evidencias CAEX del proyecto de Granulometría (data/raw/evidencias_caex/images). Se seleccionaron para observar el comportamiento del pipeline sobre un volumen mayor y obtener una referencia descriptiva de cómo se distribuyen las cargas en diversos escenarios. La muestra se procesa con confianza 0,35 y selección de la instancia de mayor área. Se obtienen 1.183 imágenes válidas y 65 no evaluables. De estas últimas, 42 corresponden a máscaras vacías y 23 a máscaras que tocan algún borde de la imagen. El descarte por borde evita que una carga incompleta genere picos falsos o una simetría artificial.</w:t>
       </w:r>
     </w:p>
     <w:p>
@@ -9195,7 +9197,7 @@
         <w:rPr>
           <w:lang w:val="es-CL"/>
         </w:rPr>
-        <w:t>La predominancia de centrado describe las salidas del sistema sobre esta muestra. No constituye por sí sola una medición de calidad del carguío ni de exactitud, porque las 1.248 imágenes no poseen una etiqueta esperada independiente para cada caso y pueden contener múltiples fotogramas del mismo evento.</w:t>
+        <w:t>La predominancia de centrado describe las salidas del sistema sobre esta muestra amplia y permite observar su distribución en distintos escenarios. No constituye una medición de exactitud ni, por sí sola, una evaluación de la calidad del carguío, porque las 1.248 imágenes no poseen una etiqueta esperada independiente para cada caso y pueden contener múltiples fotogramas del mismo evento.</w:t>
       </w:r>
     </w:p>
     <w:p>
@@ -9452,7 +9454,7 @@
       </w:pPr>
       <w:r>
         <w:rPr/>
-        <w:t>La prueba técnica tiene 90 imágenes seleccionadas y no se documenta independencia respecto del desarrollo previo del modelo de percepción.</w:t>
+        <w:t>La prueba técnica se limita a 90 imágenes seleccionadas visualmente. Aunque proceden de una base distinta y de fechas posteriores al conjunto usado para entrenar el segmentador, su tamaño y selección balanceada no reemplazan una evaluación prospectiva por secuencias completas, eventos independientes y condiciones operacionales más diversas.</w:t>
       </w:r>
     </w:p>
     <w:p>
@@ -11496,8 +11498,7 @@
         <w:rPr>
           <w:lang w:val="es-CL"/>
         </w:rPr>
-        <w:lastRenderedPageBreak/>
-        <w:t>ANEXO B. OBSERVACIONES EDITORIALES PARA LA INTEGRACIÓN</w:t>
+        <w:t>ANEXO B. PENDIENTES EDITORIALES PARA LA INTEGRACIÓN</w:t>
       </w:r>
       <w:bookmarkEnd w:id="49"/>
     </w:p>
@@ -11528,7 +11529,7 @@
           <w:color w:val="C00000"/>
           <w:lang w:val="es-CL"/>
         </w:rPr>
-        <w:t>Confirmar el nombre oficial de la carrera, departamento y título definitivo de la Memoria para reemplazar la portada provisional.</w:t>
+        <w:t>Definir el título definitivo de la Memoria y reemplazar el título provisional de la portada.</w:t>
       </w:r>
     </w:p>
     <w:p>
@@ -11543,7 +11544,7 @@
           <w:color w:val="C00000"/>
           <w:lang w:val="es-CL"/>
         </w:rPr>
-        <w:t>Confirmar si Collahuasi debe figurar como institución colaboradora formal o únicamente como origen de los datos.</w:t>
+        <w:t>Ajustar la numeración final de capítulos, tablas, figuras y anexos al fusionar esta parte con Granulometría; el prefijo C se mantiene provisionalmente.</w:t>
       </w:r>
     </w:p>
     <w:p>
@@ -11558,79 +11559,7 @@
           <w:color w:val="C00000"/>
           <w:lang w:val="es-CL"/>
         </w:rPr>
-        <w:t>Definir la numeración final al fusionar esta parte con Granulometría; el prefijo C es deliberadamente provisional.</w:t>
-      </w:r>
-    </w:p>
-    <w:p>
-      <w:pPr>
-        <w:pStyle w:val="Listaconvietas"/>
-        <w:rPr>
-          <w:lang w:val="es-CL"/>
-        </w:rPr>
-      </w:pPr>
-      <w:r>
-        <w:rPr>
-          <w:color w:val="C00000"/>
-          <w:lang w:val="es-CL"/>
-        </w:rPr>
-        <w:t>Reemplazar todos los marcadores amarillos por figuras seleccionadas y añadir su fuente cuando corresponda.</w:t>
-      </w:r>
-    </w:p>
-    <w:p>
-      <w:pPr>
-        <w:pStyle w:val="Listaconvietas"/>
-        <w:rPr>
-          <w:lang w:val="es-CL"/>
-        </w:rPr>
-      </w:pPr>
-      <w:r>
-        <w:rPr/>
-        <w:t>Confirmar la denominación pública y las métricas que se informarán para el modelo de percepción entrenado utilizado en la versión final.</w:t>
-      </w:r>
-    </w:p>
-    <w:p>
-      <w:pPr>
-        <w:pStyle w:val="Listaconvietas"/>
-        <w:rPr>
-          <w:lang w:val="es-CL"/>
-        </w:rPr>
-      </w:pPr>
-      <w:r>
-        <w:rPr>
-          <w:color w:val="C00000"/>
-          <w:lang w:val="es-CL"/>
-        </w:rPr>
-        <w:t>Documentar la independencia temporal de los conjuntos y la procedencia exacta de las 90 imágenes antes de presentar el 88,89 % como resultado final de generalización.</w:t>
-      </w:r>
-    </w:p>
-    <w:p>
-      <w:pPr>
-        <w:pStyle w:val="Listaconvietas"/>
-        <w:rPr>
-          <w:lang w:val="es-CL"/>
-        </w:rPr>
-      </w:pPr>
-      <w:r>
-        <w:rPr>
-          <w:color w:val="C00000"/>
-          <w:lang w:val="es-CL"/>
-        </w:rPr>
-        <w:t>Decidir si la muestra de 1.248 imágenes pertenece al cuerpo de resultados o a una presentación ejecutiva; su análisis es descriptivo, no una evaluación de exactitud.</w:t>
-      </w:r>
-    </w:p>
-    <w:p>
-      <w:pPr>
-        <w:pStyle w:val="Listaconvietas"/>
-        <w:rPr>
-          <w:lang w:val="es-CL"/>
-        </w:rPr>
-      </w:pPr>
-      <w:r>
-        <w:rPr>
-          <w:color w:val="C00000"/>
-          <w:lang w:val="es-CL"/>
-        </w:rPr>
-        <w:t>Actualizar fecha de consulta de referencias y revisar el estilo bibliográfico exigido por la carrera al cerrar el documento completo.</w:t>
+        <w:t>Actualizar las fechas de consulta de las referencias y aplicar el estilo bibliográfico exigido por la carrera al cerrar el documento completo.</w:t>
       </w:r>
     </w:p>
     <w:sectPr>

</xml_diff>

<commit_message>
feat: ejecuta la inferencia YOLO sin Docker
</commit_message>
<xml_diff>
--- a/deliverables/informe_final/Parte_Cono_de_Carga_Informe_Final.docx
+++ b/deliverables/informe_final/Parte_Cono_de_Carga_Informe_Final.docx
@@ -218,7 +218,7 @@
       </w:pPr>
       <w:r>
         <w:rPr/>
-        <w:t>La implementación integra Python, OpenCV, NumPy, SciPy, Pandas, Ultralytics, Docker, NVIDIA CUDA, MLflow y Streamlit. El repositorio de percepción registra un entrenamiento reproducible con 240 imágenes y conserva su best.pt como checkpoint alternativo. Para la operación se seleccionó el modelo principal PSINet. En una prueba técnica balanceada de 90 imágenes, el pipeline obtiene 88,89 % de exactitud global: 73,33 % para centrado, 93,33 % para izquierda y 100 % para derecha. Las medianas de pico, simetría y centroide son cercanas a cero para centrado, negativas para izquierda y positivas para derecha, lo que aporta una explicación geométrica consistente. Una muestra descriptiva de 1.248 imágenes contiene 1.183 casos evaluables y 65 no evaluables. Los resultados confirman que la segmentación condiciona la clasificación. Las salidas representan asimetría visual interna, no balance físico, distribución real del material ni desplazamiento respecto de la tolva.</w:t>
+        <w:t>La implementación integra Python, OpenCV, NumPy, SciPy, Pandas, Ultralytics, NVIDIA CUDA, MLflow y Streamlit. Docker encapsula el entrenamiento, mientras la inferencia y el pipeline se ejecutan en un entorno Python local. El repositorio de percepción registra un entrenamiento reproducible con 240 imágenes y conserva su best.pt como checkpoint alternativo. Para la operación se seleccionó el modelo principal PSINet. En una prueba técnica balanceada de 90 imágenes, el pipeline obtiene 88,89 % de exactitud global: 73,33 % para centrado, 93,33 % para izquierda y 100 % para derecha. Las medianas de pico, simetría y centroide son cercanas a cero para centrado, negativas para izquierda y positivas para derecha, lo que aporta una explicación geométrica consistente. Una muestra descriptiva de 1.248 imágenes contiene 1.183 casos evaluables y 65 no evaluables. Los resultados confirman que la segmentación condiciona la clasificación. Las salidas representan asimetría visual interna, no balance físico, distribución real del material ni desplazamiento respecto de la tolva.</w:t>
       </w:r>
     </w:p>
     <w:p>
@@ -265,7 +265,7 @@
     <w:p>
       <w:r>
         <w:rPr/>
-        <w:t>The implementation combines Python, OpenCV, NumPy, SciPy, Pandas, Ultralytics, Docker, NVIDIA CUDA, MLflow, and Streamlit. The repository records a reproducible training run with 240 images and retains its best.pt as an alternative checkpoint, while PSINet is used as the primary operational segmenter. In a balanced technical evaluation with 90 visually selected images, the complete pipeline reaches 88.89% overall accuracy. Median apex, area-symmetry, and centroid indicators remain close to zero for centered loads, negative for left cases, and positive for right cases. A separate descriptive sample of 1,248 images contains 1,183 evaluable and 65 non-evaluable cases.</w:t>
+        <w:t>The implementation combines Python, OpenCV, NumPy, SciPy, Pandas, Ultralytics, NVIDIA CUDA, MLflow, and Streamlit. Docker encapsulates training, while inference and the operational pipeline run in a local Python environment. The repository records a reproducible training run with 240 images and retains its best.pt as an alternative checkpoint, while PSINet is used as the primary operational segmenter. In a balanced technical evaluation with 90 visually selected images, the complete pipeline reaches 88.89% overall accuracy. Median apex, area-symmetry, and centroid indicators remain close to zero for centered loads, negative for left cases, and positive for right cases. A separate descriptive sample of 1,248 images contains 1,183 evaluable and 65 non-evaluable cases.</w:t>
       </w:r>
     </w:p>
     <w:p>
@@ -2119,19 +2119,8 @@
             <w:vAlign w:val="center"/>
           </w:tcPr>
           <w:p>
-            <w:pPr>
-              <w:spacing w:after="0" w:line="240" w:lineRule="auto"/>
-              <w:jc w:val="left"/>
-              <w:rPr>
-                <w:lang w:val="es-CL"/>
-              </w:rPr>
-            </w:pPr>
-            <w:r>
-              <w:rPr>
-                <w:sz w:val="19"/>
-                <w:lang w:val="es-CL"/>
-              </w:rPr>
-              <w:t>El entorno de percepción se construye con Docker y dependencias fijadas.</w:t>
+            <w:r>
+              <w:t>El entorno de entrenamiento se construye con Docker y dependencias fijadas.</w:t>
             </w:r>
           </w:p>
         </w:tc>
@@ -2326,7 +2315,7 @@
       <w:r>
         <w:drawing>
           <wp:inline xmlns:a="http://schemas.openxmlformats.org/drawingml/2006/main" xmlns:pic="http://schemas.openxmlformats.org/drawingml/2006/picture">
-            <wp:extent cx="5806440" cy="2903220"/>
+            <wp:extent cx="5212080" cy="2606040"/>
             <wp:docPr id="2" name="Picture 2" descr="Arquitectura del sistema desde video hasta resultados y aplicación web." title="Arquitectura del sistema desde video hasta resultados y aplicación web."/>
             <wp:cNvGraphicFramePr>
               <a:graphicFrameLocks noChangeAspect="1"/>
@@ -2347,7 +2336,7 @@
                   <pic:spPr>
                     <a:xfrm>
                       <a:off x="0" y="0"/>
-                      <a:ext cx="5806440" cy="2903220"/>
+                      <a:ext cx="5212080" cy="2606040"/>
                     </a:xfrm>
                     <a:prstGeom prst="rect"/>
                   </pic:spPr>
@@ -2894,15 +2883,8 @@
             <w:vAlign w:val="center"/>
           </w:tcPr>
           <w:p>
-            <w:pPr>
-              <w:spacing w:after="0" w:line="240" w:lineRule="auto"/>
-              <w:jc w:val="center"/>
-            </w:pPr>
-            <w:r>
-              <w:rPr>
-                <w:sz w:val="19"/>
-              </w:rPr>
-              <w:t>Python y Docker Compose</w:t>
+            <w:r>
+              <w:t>Python local</w:t>
             </w:r>
           </w:p>
         </w:tc>
@@ -2912,19 +2894,8 @@
             <w:vAlign w:val="center"/>
           </w:tcPr>
           <w:p>
-            <w:pPr>
-              <w:spacing w:after="0" w:line="240" w:lineRule="auto"/>
-              <w:jc w:val="left"/>
-              <w:rPr>
-                <w:lang w:val="es-CL"/>
-              </w:rPr>
-            </w:pPr>
-            <w:r>
-              <w:rPr>
-                <w:sz w:val="19"/>
-                <w:lang w:val="es-CL"/>
-              </w:rPr>
-              <w:t>Ejecutar en orden los componentes y construir un resumen por video.</w:t>
+            <w:r>
+              <w:t>Orquestar las etapas y construir el resumen por video.</w:t>
             </w:r>
           </w:p>
         </w:tc>
@@ -6878,7 +6849,7 @@
         <w:rPr>
           <w:lang w:val="es-CL"/>
         </w:rPr>
-        <w:t>La inferencia de YOLO utiliza el modelo entrenado solo cuando el contenedor Docker está disponible, porque las dependencias de PyTorch, CUDA y Ultralytics se encapsulan allí. El resto del pipeline se ejecuta con Python local. Esta decisión simplifica la reproducción del entorno GPU, aunque introduce como requisito operativo Docker Desktop y un controlador NVIDIA compatible.</w:t>
+        <w:t>La inferencia operacional de YOLO se ejecuta con PyTorch y Ultralytics en el entorno Python local del proyecto. El orquestador invoca el adaptador de máscaras mediante el mismo intérprete que usa la aplicación web, por lo que no requiere Docker ni conversiones de rutas durante el análisis. Docker se reserva para el entrenamiento y la validación reproducibles con GPU.</w:t>
       </w:r>
     </w:p>
     <w:p>
@@ -9522,7 +9493,7 @@
         <w:rPr>
           <w:lang w:val="es-CL"/>
         </w:rPr>
-        <w:t>La aplicación depende de Docker y GPU para la inferencia encapsulada; no se evalúan latencia sostenida ni disponibilidad operacional.</w:t>
+        <w:t>La aplicación depende del entorno local de PyTorch, Ultralytics y del controlador NVIDIA para acelerar la inferencia. Docker no es un requisito operacional, pero no se evalúan todavía la latencia sostenida ni la disponibilidad del sistema en producción.</w:t>
       </w:r>
     </w:p>
     <w:p>

</xml_diff>

<commit_message>
docs: prepara el informe de cono para la fusion final
</commit_message>
<xml_diff>
--- a/deliverables/informe_final/Parte_Cono_de_Carga_Informe_Final.docx
+++ b/deliverables/informe_final/Parte_Cono_de_Carga_Informe_Final.docx
@@ -218,7 +218,7 @@
       </w:pPr>
       <w:r>
         <w:rPr/>
-        <w:t>La implementación integra Python, OpenCV, NumPy, SciPy, Pandas, Ultralytics, NVIDIA CUDA, MLflow y Streamlit. Docker encapsula el entrenamiento, mientras la inferencia y el pipeline se ejecutan en un entorno Python local. El repositorio de percepción registra un entrenamiento reproducible con 240 imágenes y conserva su best.pt como checkpoint alternativo. Para la operación se seleccionó el modelo principal PSINet. En una prueba técnica balanceada de 90 imágenes, el pipeline obtiene 88,89 % de exactitud global: 73,33 % para centrado, 93,33 % para izquierda y 100 % para derecha. Las medianas de pico, simetría y centroide son cercanas a cero para centrado, negativas para izquierda y positivas para derecha, lo que aporta una explicación geométrica consistente. Una muestra descriptiva de 1.248 imágenes contiene 1.183 casos evaluables y 65 no evaluables. Los resultados confirman que la segmentación condiciona la clasificación. Las salidas representan asimetría visual interna, no balance físico, distribución real del material ni desplazamiento respecto de la tolva.</w:t>
+        <w:t>La implementación integra Python, OpenCV, NumPy, SciPy, Pandas, Ultralytics, NVIDIA CUDA, MLflow y Streamlit. Docker encapsula el entrenamiento, mientras la inferencia y el pipeline se ejecutan en un entorno Python local. El modelo operativo de percepción es el mismo checkpoint PSINet utilizado por Granulometría para segmentar la clase material. El repositorio de Cono registra además un entrenamiento reproducible con 240 imágenes y conserva su best.pt como checkpoint alternativo. En una prueba técnica balanceada de 90 imágenes, el pipeline obtiene 88,89 % de exactitud global: 73,33 % para centrado, 93,33 % para izquierda y 100 % para derecha. Las medianas de pico, simetría y centroide son cercanas a cero para centrado, negativas para izquierda y positivas para derecha, lo que aporta una explicación geométrica consistente. Una muestra descriptiva de 1.248 imágenes contiene 1.183 casos evaluables y 65 no evaluables. Los resultados confirman que la segmentación condiciona la clasificación. Las salidas representan asimetría visual interna, no balance físico, distribución real del material ni desplazamiento respecto de la tolva.</w:t>
       </w:r>
     </w:p>
     <w:p>
@@ -265,7 +265,7 @@
     <w:p>
       <w:r>
         <w:rPr/>
-        <w:t>The implementation combines Python, OpenCV, NumPy, SciPy, Pandas, Ultralytics, NVIDIA CUDA, MLflow, and Streamlit. Docker encapsulates training, while inference and the operational pipeline run in a local Python environment. The repository records a reproducible training run with 240 images and retains its best.pt as an alternative checkpoint, while PSINet is used as the primary operational segmenter. In a balanced technical evaluation with 90 visually selected images, the complete pipeline reaches 88.89% overall accuracy. Median apex, area-symmetry, and centroid indicators remain close to zero for centered loads, negative for left cases, and positive for right cases. A separate descriptive sample of 1,248 images contains 1,183 evaluable and 65 non-evaluable cases.</w:t>
+        <w:t>The implementation combines Python, OpenCV, NumPy, SciPy, Pandas, Ultralytics, NVIDIA CUDA, MLflow, and Streamlit. Docker encapsulates training, while inference and the operational pipeline run in a local Python environment. The operational perception model is the same PSINet checkpoint used by the Granulometry pipeline to segment the material class. The Cono repository also records a reproducible training run with 240 images and retains its best.pt as an alternative checkpoint. In a balanced technical evaluation with 90 visually selected images, the complete pipeline reaches 88.89% overall accuracy. Median apex, area-symmetry, and centroid indicators remain close to zero for centered loads, negative for left cases, and positive for right cases. A separate descriptive sample of 1,248 images contains 1,183 evaluable and 65 non-evaluable cases.</w:t>
       </w:r>
     </w:p>
     <w:p>
@@ -3041,7 +3041,7 @@
         <w:rPr>
           <w:lang w:val="es-CL"/>
         </w:rPr>
-        <w:t>El etiquetado manual se realiza en CVAT sobre la carga visible. La exportación Segmentation Mask organiza las imágenes en JPEGImages, las máscaras en SegmentationClass y las clases en labelmap.txt [9]. La clase Carga se codifica con RGB [102, 255, 102] y el fondo con [0, 0, 0]. En esta etapa no se etiqueta la tolva, por lo que el modelo aprende únicamente la apariencia del material visible.</w:t>
+        <w:t>El etiquetado manual preparado en este repositorio corresponde al experimento del checkpoint alternativo. Se realiza en CVAT sobre la carga visible y se exporta en formato Segmentation Mask: las imágenes quedan en JPEGImages, las máscaras en SegmentationClass y las clases en labelmap.txt [9]. La clase Carga se codifica con RGB [102, 255, 102] y el fondo con [0, 0, 0]. Este conjunto local contiene una sola clase de carga y no debe confundirse con el entrenamiento del modelo operativo compartido, cuyos pesos contienen las clases 0: caex y 1: material. En ninguno de los dos casos se dispone de una máscara de tolva para el analítico geométrico.</w:t>
       </w:r>
     </w:p>
     <w:p>
@@ -4243,7 +4243,7 @@
         </w:rPr>
       </w:pPr>
       <w:r>
-        <w:t>El pipeline utiliza como segmentador principal perception/models/primary/psinet_carga_visible.pt y selecciona su clase material (class_id=1). El checkpoint perception/models/alternative/best.pt se mantiene para respaldo y comparaciones controladas con su clase Carga (class_id=0). Durante la inferencia se aplica una confianza de 0,35 y el modo largest conserva la instancia de carga de mayor área. La predicción se rasteriza como una única máscara RGB, contrato de entrada del analítico geométrico.</w:t>
+        <w:t>El pipeline usa perception/models/primary/psinet_carga_visible.pt como segmentador operativo y selecciona material (class_id=1). El archivo es binariamente idéntico al empleado por Granulometría: arquitectura YOLOv8m-seg, clases caex/material, imgsz=736 en sus metadatos y SHA256 BD7C9880D9A39B291DC03669DAD774DB9FD933D6026DF694EEE1E3A41CBF1DAB. La evaluación de Cono usa imgsz=640, confianza 0,35 y modo largest. El checkpoint alternativo best.pt queda como respaldo reproducible y usa Carga (class_id=0). La predicción se rasteriza como máscara RGB para el analítico. Compartir pesos no implica compartir parámetros ni postprocesamiento.</w:t>
       </w:r>
     </w:p>
     <w:p>
@@ -5176,15 +5176,8 @@
             <w:vAlign w:val="center"/>
           </w:tcPr>
           <w:p>
-            <w:pPr>
-              <w:spacing w:after="0" w:line="240" w:lineRule="auto"/>
-              <w:jc w:val="left"/>
-            </w:pPr>
-            <w:r>
-              <w:rPr>
-                <w:sz w:val="19"/>
-              </w:rPr>
-              <w:t>mask_area_px, unexpected_color_fraction</w:t>
+            <w:r>
+              <w:t>mask_area_px, unexpected_pixel_count, unexpected_color_count</w:t>
             </w:r>
           </w:p>
         </w:tc>
@@ -5240,15 +5233,8 @@
             <w:vAlign w:val="center"/>
           </w:tcPr>
           <w:p>
-            <w:pPr>
-              <w:spacing w:after="0" w:line="240" w:lineRule="auto"/>
-              <w:jc w:val="left"/>
-            </w:pPr>
-            <w:r>
-              <w:rPr>
-                <w:sz w:val="19"/>
-              </w:rPr>
-              <w:t>bbox_xmin, ymin, xmax, ymax, width, height, aspect_ratio</w:t>
+            <w:r>
+              <w:t>bbox_xmin, bbox_ymin, bbox_xmax, bbox_ymax, bbox_width, bbox_height, bbox_aspect_ratio</w:t>
             </w:r>
           </w:p>
         </w:tc>
@@ -5305,15 +5291,8 @@
             <w:vAlign w:val="center"/>
           </w:tcPr>
           <w:p>
-            <w:pPr>
-              <w:spacing w:after="0" w:line="240" w:lineRule="auto"/>
-              <w:jc w:val="left"/>
-            </w:pPr>
-            <w:r>
-              <w:rPr>
-                <w:sz w:val="19"/>
-              </w:rPr>
-              <w:t>touches_left/right/top/bottom_border, is_truncated</w:t>
+            <w:r>
+              <w:t>touches_left_border, touches_right_border, touches_top_border, touches_bottom_border, is_truncated_by_frame</w:t>
             </w:r>
           </w:p>
         </w:tc>
@@ -5627,15 +5606,8 @@
             <w:vAlign w:val="center"/>
           </w:tcPr>
           <w:p>
-            <w:pPr>
-              <w:spacing w:after="0" w:line="240" w:lineRule="auto"/>
-              <w:jc w:val="left"/>
-            </w:pPr>
-            <w:r>
-              <w:rPr>
-                <w:sz w:val="19"/>
-              </w:rPr>
-              <w:t>predicted_class, is_valid, error, warnings</w:t>
+            <w:r>
+              <w:t>predicted_class, is_valid, error_reason, warnings</w:t>
             </w:r>
           </w:p>
         </w:tc>
@@ -6539,7 +6511,7 @@
         <w:rPr>
           <w:lang w:val="es-CL"/>
         </w:rPr>
-        <w:t>Se levanta o reutiliza el contenedor de percepción y se ejecuta inferencia YOLO sobre el directorio de fotogramas.</w:t>
+        <w:t>2. El orquestador ejecuta localmente el adaptador de percepción con el mismo intérprete Python del pipeline y realiza inferencia YOLO sobre el directorio de fotogramas.</w:t>
       </w:r>
     </w:p>
     <w:p>
@@ -6906,7 +6878,7 @@
       </w:pPr>
       <w:r>
         <w:rPr/>
-        <w:t>Las 90 imágenes proceden del banco de evidencias CAEX del proyecto de Granulometría (data/raw/evidencias_caex/images), una base distinta del entrenamiento y formada por registros de fechas posteriores. Se seleccionaron visualmente 30 casos centrados, 30 a izquierda y 30 a derecha. Las etiquetas representan apariencia visual, no mediciones físicas. La separación temporal reduce el riesgo de reutilizar imágenes de entrenamiento, aunque el tamaño y la selección dirigida mantienen el resultado como validación técnica local.</w:t>
+        <w:t>Las 90 imágenes proceden del banco de evidencias CAEX del proyecto de Granulometría (data/raw/evidencias_caex/images) y corresponden a registros posteriores al conjunto local de 240 imágenes utilizado para el checkpoint alternativo. Se seleccionaron visualmente 30 casos centrados, 30 a izquierda y 30 a derecha. Este conjunto es distinto de la prueba técnica de 90 imágenes de Granulometría y no comparte nombres de archivo con ella. Las etiquetas representan apariencia visual, no mediciones físicas. La separación temporal reduce el riesgo de reutilizar imágenes, aunque la independencia respecto del entrenamiento original de PSINet debe quedar respaldada por su manifiesto al integrar el informe definitivo. El tamaño y la selección dirigida mantienen el resultado como validación técnica local.</w:t>
       </w:r>
     </w:p>
     <w:p>
@@ -6986,7 +6958,6 @@
       <w:pPr>
         <w:pStyle w:val="Descripcin"/>
         <w:keepNext/>
-        <w:pageBreakBefore/>
         <w:rPr>
           <w:lang w:val="es-CL"/>
         </w:rPr>
@@ -9425,7 +9396,7 @@
       </w:pPr>
       <w:r>
         <w:rPr/>
-        <w:t>La prueba técnica se limita a 90 imágenes seleccionadas visualmente. Aunque proceden de una base distinta y de fechas posteriores al conjunto usado para entrenar el segmentador, su tamaño y selección balanceada no reemplazan una evaluación prospectiva por secuencias completas, eventos independientes y condiciones operacionales más diversas.</w:t>
+        <w:t>La prueba técnica se limita a 90 imágenes seleccionadas visualmente. Proceden de fechas posteriores y son independientes del conjunto local de 240 imágenes usado para entrenar el checkpoint alternativo. No obstante, la independencia respecto del dataset original del modelo PSINet debe confirmarse mediante un manifiesto común. Su tamaño y selección balanceada no reemplazan una evaluación prospectiva por secuencias completas, eventos independientes y condiciones operacionales más diversas.</w:t>
       </w:r>
     </w:p>
     <w:p>
@@ -9436,7 +9407,7 @@
         </w:rPr>
       </w:pPr>
       <w:r>
-        <w:t>Los subconjuntos de 240 imágenes no documentan separación por evento o video, lo que puede sobreestimar métricas si existen cuadros cercanos entre particiones.</w:t>
+        <w:t>Los subconjuntos de 240 imágenes utilizados para entrenar el checkpoint alternativo no documentan separación por evento o video, lo que puede sobreestimar sus métricas si existen cuadros cercanos entre particiones.</w:t>
       </w:r>
     </w:p>
     <w:p>
@@ -9571,7 +9542,7 @@
         </w:rPr>
       </w:pPr>
       <w:r>
-        <w:t>El repositorio mantiene configuración y código separados de datos y resultados. Los umbrales del analítico residen en analytic_config.yaml; los parámetros de percepción, en YAML; y las credenciales de MLflow, en un archivo de entorno excluido de Git. El modelo principal PSINet y el checkpoint alternativo best.pt se conservan en rutas explícitas, mientras MLflow mantiene la trazabilidad del entrenamiento.</w:t>
+        <w:t>El repositorio mantiene configuración y código separados de datos y resultados. Los umbrales del analítico residen en analytic_config.yaml; los parámetros de percepción, en YAML; y las credenciales de MLflow, en un archivo de entorno excluido de Git. El modelo principal PSINet está versionado en Git y se identifica mediante su SHA256; el checkpoint alternativo best.pt se conserva en una ruta separada. MLflow mantiene la trazabilidad del entrenamiento del checkpoint alternativo, no del entrenamiento original de PSINet. Una suite automatizada inicial verifica la inferencia local sin Docker y los resúmenes estadísticos; la cobertura de geometría, reglas y pipeline completo todavía debe ampliarse.</w:t>
       </w:r>
     </w:p>
     <w:p>
@@ -9637,7 +9608,7 @@
         <w:rPr>
           <w:lang w:val="es-CL"/>
         </w:rPr>
-        <w:t>Se implementa una solución funcional que transforma videos o imágenes de camiones CAEX en máscaras de carga, variables geométricas, clases visuales, overlays y veredictos por video. El sistema integra extracción de fotogramas, segmentación YOLO, adaptación de máscaras, analítica y visualización sin entrenar un clasificador adicional para la geometría.</w:t>
+        <w:t>Se implementa una solución funcional que transforma videos o imágenes de camiones CAEX en máscaras de carga, variables geométricas, clases visuales, overlays y veredictos por video. El sistema integra extracción de fotogramas, una base de percepción YOLO compartida con Granulometría, un adaptador de máscaras específico de Cono, analítica y visualización sin entrenar un clasificador adicional para la geometría.</w:t>
       </w:r>
     </w:p>
     <w:p>
@@ -10235,7 +10206,7 @@
       </w:pPr>
       <w:r>
         <w:rPr/>
-        <w:t>Versionar explícitamente el modelo principal y el checkpoint alternativo, y registrar junto a cada corrida la ruta del peso, la clase seleccionada, el umbral de confianza y el conjunto de evaluación.</w:t>
+        <w:t>Definir un manifiesto común de percepción para Cono y Granulometría que registre nombre canónico, SHA256, clases y procedencia del modelo; cada corrida debe conservar además la ruta del peso, imgsz, class_id, confianza, modo de combinación y conjunto de evaluación.</w:t>
       </w:r>
     </w:p>
     <w:p>
@@ -11469,7 +11440,7 @@
         <w:rPr>
           <w:lang w:val="es-CL"/>
         </w:rPr>
-        <w:t>ANEXO B. PENDIENTES EDITORIALES PARA LA INTEGRACIÓN</w:t>
+        <w:t>ANEXO B. PUNTOS POR DEFINIR PARA LA FUSIÓN DEL INFORME</w:t>
       </w:r>
       <w:bookmarkEnd w:id="49"/>
     </w:p>
@@ -11515,22 +11486,110 @@
           <w:color w:val="C00000"/>
           <w:lang w:val="es-CL"/>
         </w:rPr>
+        <w:t>Diseñar una introducción y un marco institucional únicos para Cono y Granulometría, evitando repetir los roles de la Universidad de Concepción, PSINet y Collahuasi.</w:t>
+      </w:r>
+    </w:p>
+    <w:p>
+      <w:pPr>
+        <w:pStyle w:val="Listaconvietas"/>
+        <w:rPr>
+          <w:lang w:val="es-CL"/>
+        </w:rPr>
+      </w:pPr>
+      <w:r>
+        <w:rPr>
+          <w:color w:val="C00000"/>
+          <w:lang w:val="es-CL"/>
+        </w:rPr>
+        <w:t>Presentar una sola base común de percepción: nombre canónico del checkpoint PSINet, SHA256, clases caex/material, procedencia, limitaciones y contrato de máscara.</w:t>
+      </w:r>
+    </w:p>
+    <w:p>
+      <w:pPr>
+        <w:pStyle w:val="Listaconvietas"/>
+      </w:pPr>
+      <w:r>
+        <w:rPr>
+          <w:color w:val="C00000"/>
+        </w:rPr>
+        <w:t>Definir si el modelo común residirá en una ubicación compartida o si cada módulo conservará una copia validada por hash; documentar la decisión de despliegue.</w:t>
+      </w:r>
+    </w:p>
+    <w:p>
+      <w:pPr>
+        <w:pStyle w:val="Listaconvietas"/>
+      </w:pPr>
+      <w:r>
+        <w:rPr>
+          <w:color w:val="C00000"/>
+        </w:rPr>
+        <w:t>Separar los parámetros comunes del modelo de los postprocesamientos específicos: Cono usa imgsz=640, conf=0,35 y largest; Granulometría mantiene su propia configuración y estrategia de unión.</w:t>
+      </w:r>
+    </w:p>
+    <w:p>
+      <w:pPr>
+        <w:pStyle w:val="Listaconvietas"/>
+      </w:pPr>
+      <w:r>
+        <w:rPr>
+          <w:color w:val="C00000"/>
+        </w:rPr>
+        <w:t>Distinguir explícitamente las dos pruebas técnicas de 90 imágenes, sus etiquetas, unidades de evaluación, métricas y ausencia de nombres de archivo compartidos.</w:t>
+      </w:r>
+    </w:p>
+    <w:p>
+      <w:pPr>
+        <w:pStyle w:val="Listaconvietas"/>
+      </w:pPr>
+      <w:r>
+        <w:rPr>
+          <w:color w:val="C00000"/>
+        </w:rPr>
+        <w:t>Consolidar una sección única de datos que diferencie universo audiovisual, datasets de percepción, datasets analíticos, muestras descriptivas y dependencia temporal entre fotogramas.</w:t>
+      </w:r>
+    </w:p>
+    <w:p>
+      <w:pPr>
+        <w:pStyle w:val="Listaconvietas"/>
+      </w:pPr>
+      <w:r>
+        <w:rPr>
+          <w:color w:val="C00000"/>
+        </w:rPr>
+        <w:t>Unificar la descripción de ejecución: inferencia local para ambos pipelines y Docker reservado al entrenamiento reproducible y servicios asociados.</w:t>
+      </w:r>
+    </w:p>
+    <w:p>
+      <w:pPr>
+        <w:pStyle w:val="Listaconvietas"/>
+      </w:pPr>
+      <w:r>
+        <w:rPr>
+          <w:color w:val="C00000"/>
+        </w:rPr>
+        <w:t>Integrar conclusiones y limitaciones transversales sin mezclar asimetría visual interna con granulometría visual aparente ni atribuirles magnitudes físicas.</w:t>
+      </w:r>
+    </w:p>
+    <w:p>
+      <w:pPr>
+        <w:pStyle w:val="Listaconvietas"/>
+      </w:pPr>
+      <w:r>
+        <w:rPr>
+          <w:color w:val="C00000"/>
+        </w:rPr>
         <w:t>Ajustar la numeración final de capítulos, tablas, figuras y anexos al fusionar esta parte con Granulometría; el prefijo C se mantiene provisionalmente.</w:t>
       </w:r>
     </w:p>
     <w:p>
       <w:pPr>
         <w:pStyle w:val="Listaconvietas"/>
-        <w:rPr>
-          <w:lang w:val="es-CL"/>
-        </w:rPr>
       </w:pPr>
       <w:r>
         <w:rPr>
           <w:color w:val="C00000"/>
-          <w:lang w:val="es-CL"/>
-        </w:rPr>
-        <w:t>Actualizar las fechas de consulta de las referencias y aplicar el estilo bibliográfico exigido por la carrera al cerrar el documento completo.</w:t>
+        </w:rPr>
+        <w:t>Actualizar las fechas de consulta, eliminar este anexo de trabajo y aplicar el estilo bibliográfico exigido por la carrera antes de entregar el documento completo.</w:t>
       </w:r>
     </w:p>
     <w:sectPr>

</xml_diff>